<commit_message>
Added log funtion to reduce high ranges of std deviation, this ensures one-to-one mapping can take place. Andy Farnell's sound design patches have been added to the file structure. Plan is for two patch options to be created, one utilising these. Application is currently not working for the time-domain, as power spectrum data is being tested. A base patch has been implemented to maintain structure.Two previously mentioned patches will use this as a base. Peak count is now being sent to pure data, each peak ideally will have an effect on the sonification.
</commit_message>
<xml_diff>
--- a/Python/src/Datasets/Satellite_Data/Whistler Wave Database/Readme file.docx
+++ b/Python/src/Datasets/Satellite_Data/Whistler Wave Database/Readme file.docx
@@ -8,7 +8,37 @@
         <w:t>Readme file</w:t>
       </w:r>
     </w:p>
-    <w:p/>
+    <w:p>
+      <w:pPr>
+        <w:rPr>
+          <w:b w:val="1"/>
+          <w:bCs w:val="1"/>
+          <w:u w:val="single"/>
+        </w:rPr>
+      </w:pPr>
+      <w:r>
+        <w:rPr>
+          <w:b w:val="1"/>
+          <w:bCs w:val="1"/>
+          <w:u w:val="single"/>
+        </w:rPr>
+        <w:t>Waveform Files</w:t>
+      </w:r>
+    </w:p>
+    <w:p>
+      <w:r>
+        <w:rPr/>
+        <w:t>These are formed from the time series data for the electromagnetic wave measurements, rotated to co-ordinates rotated to</w:t>
+      </w:r>
+      <w:r>
+        <w:rPr/>
+        <w:t xml:space="preserve"> </w:t>
+      </w:r>
+      <w:r>
+        <w:rPr/>
+        <w:t>frame of reference aligned to Earth’s magnetic field.</w:t>
+      </w:r>
+    </w:p>
     <w:p>
       <w:r>
         <w:rPr/>
@@ -118,7 +148,179 @@
           <w:sz w:val="24"/>
           <w:szCs w:val="24"/>
         </w:rPr>
-        <w:t>This should suffice to compute moving averages, but if you want the statistical moments data at a later time, happy to generate it!</w:t>
+        <w:t xml:space="preserve">This should suffice to compute moving averages, but if you want the statistical moments data </w:t>
+      </w:r>
+      <w:r>
+        <w:rPr>
+          <w:sz w:val="24"/>
+          <w:szCs w:val="24"/>
+        </w:rPr>
+        <w:t>at a later time</w:t>
+      </w:r>
+      <w:r>
+        <w:rPr>
+          <w:sz w:val="24"/>
+          <w:szCs w:val="24"/>
+        </w:rPr>
+        <w:t>, happy to generate it!</w:t>
+      </w:r>
+    </w:p>
+    <w:p>
+      <w:pPr>
+        <w:pStyle w:val="Normal"/>
+        <w:rPr>
+          <w:b w:val="1"/>
+          <w:bCs w:val="1"/>
+          <w:sz w:val="24"/>
+          <w:szCs w:val="24"/>
+          <w:u w:val="single"/>
+        </w:rPr>
+      </w:pPr>
+      <w:r>
+        <w:rPr>
+          <w:b w:val="1"/>
+          <w:bCs w:val="1"/>
+          <w:sz w:val="24"/>
+          <w:szCs w:val="24"/>
+          <w:u w:val="single"/>
+        </w:rPr>
+        <w:t>Power Spectrum</w:t>
+      </w:r>
+    </w:p>
+    <w:p>
+      <w:pPr>
+        <w:pStyle w:val="Normal"/>
+        <w:rPr>
+          <w:b w:val="0"/>
+          <w:bCs w:val="0"/>
+          <w:sz w:val="24"/>
+          <w:szCs w:val="24"/>
+          <w:u w:val="none"/>
+        </w:rPr>
+      </w:pPr>
+      <w:r>
+        <w:rPr>
+          <w:b w:val="0"/>
+          <w:bCs w:val="0"/>
+          <w:sz w:val="24"/>
+          <w:szCs w:val="24"/>
+          <w:u w:val="none"/>
+        </w:rPr>
+        <w:t xml:space="preserve">These files are the short-time Fourier transformed </w:t>
+      </w:r>
+      <w:r>
+        <w:rPr>
+          <w:b w:val="0"/>
+          <w:bCs w:val="0"/>
+          <w:sz w:val="24"/>
+          <w:szCs w:val="24"/>
+          <w:u w:val="none"/>
+        </w:rPr>
+        <w:t xml:space="preserve">timeseries of the entire wave (1024 Hanning window), with absolute value </w:t>
+      </w:r>
+      <w:r>
+        <w:rPr>
+          <w:b w:val="0"/>
+          <w:bCs w:val="0"/>
+          <w:sz w:val="24"/>
+          <w:szCs w:val="24"/>
+          <w:u w:val="none"/>
+        </w:rPr>
+        <w:t>squared t</w:t>
+      </w:r>
+      <w:r>
+        <w:rPr>
+          <w:b w:val="0"/>
+          <w:bCs w:val="0"/>
+          <w:sz w:val="24"/>
+          <w:szCs w:val="24"/>
+          <w:u w:val="none"/>
+        </w:rPr>
+        <w:t>o make a power spectrum.</w:t>
+      </w:r>
+    </w:p>
+    <w:p>
+      <w:pPr>
+        <w:pStyle w:val="Normal"/>
+        <w:rPr>
+          <w:b w:val="0"/>
+          <w:bCs w:val="0"/>
+          <w:sz w:val="24"/>
+          <w:szCs w:val="24"/>
+          <w:u w:val="none"/>
+        </w:rPr>
+      </w:pPr>
+      <w:r>
+        <w:rPr>
+          <w:b w:val="0"/>
+          <w:bCs w:val="0"/>
+          <w:sz w:val="24"/>
+          <w:szCs w:val="24"/>
+          <w:u w:val="none"/>
+        </w:rPr>
+        <w:t xml:space="preserve"> Each file has the following columns:</w:t>
+      </w:r>
+    </w:p>
+    <w:p>
+      <w:pPr>
+        <w:pStyle w:val="ListParagraph"/>
+        <w:numPr>
+          <w:ilvl w:val="0"/>
+          <w:numId w:val="2"/>
+        </w:numPr>
+        <w:rPr>
+          <w:b w:val="0"/>
+          <w:bCs w:val="0"/>
+          <w:sz w:val="24"/>
+          <w:szCs w:val="24"/>
+          <w:u w:val="none"/>
+        </w:rPr>
+      </w:pPr>
+      <w:r>
+        <w:rPr>
+          <w:b w:val="0"/>
+          <w:bCs w:val="0"/>
+          <w:sz w:val="24"/>
+          <w:szCs w:val="24"/>
+          <w:u w:val="none"/>
+        </w:rPr>
+        <w:t>Time (in seconds)</w:t>
+      </w:r>
+    </w:p>
+    <w:p>
+      <w:pPr>
+        <w:pStyle w:val="ListParagraph"/>
+        <w:numPr>
+          <w:ilvl w:val="0"/>
+          <w:numId w:val="2"/>
+        </w:numPr>
+        <w:rPr>
+          <w:b w:val="0"/>
+          <w:bCs w:val="0"/>
+          <w:sz w:val="24"/>
+          <w:szCs w:val="24"/>
+          <w:u w:val="none"/>
+        </w:rPr>
+      </w:pPr>
+      <w:r>
+        <w:rPr>
+          <w:b w:val="0"/>
+          <w:bCs w:val="0"/>
+          <w:sz w:val="24"/>
+          <w:szCs w:val="24"/>
+          <w:u w:val="none"/>
+        </w:rPr>
+        <w:t>Powers per frequency, in units of the gyrofrequency (a special frequency for space physics, the one denoting the frequency at which an electron orbits a magnetic field line), staggered in 0.01 bins from 0.</w:t>
+      </w:r>
+      <w:r>
+        <w:rPr>
+          <w:b w:val="0"/>
+          <w:bCs w:val="0"/>
+          <w:sz w:val="24"/>
+          <w:szCs w:val="24"/>
+          <w:u w:val="none"/>
+        </w:rPr>
+        <w:t>05 to 0.5</w:t>
       </w:r>
     </w:p>
     <w:p/>
@@ -134,6 +336,118 @@
 
 <file path=word/numbering.xml><?xml version="1.0" encoding="utf-8"?>
 <w:numbering xmlns:w="http://schemas.openxmlformats.org/wordprocessingml/2006/main">
+  <w:abstractNum xmlns:w="http://schemas.openxmlformats.org/wordprocessingml/2006/main" w:abstractNumId="2">
+    <w:nsid w:val="478cfc64"/>
+    <w:multiLevelType xmlns:w="http://schemas.openxmlformats.org/wordprocessingml/2006/main" w:val="hybridMultilevel"/>
+    <w:lvl xmlns:w="http://schemas.openxmlformats.org/wordprocessingml/2006/main" w:ilvl="0">
+      <w:start w:val="1"/>
+      <w:numFmt w:val="bullet"/>
+      <w:lvlText w:val="-"/>
+      <w:lvlJc w:val="left"/>
+      <w:pPr>
+        <w:ind w:left="720" w:hanging="360"/>
+      </w:pPr>
+      <w:rPr>
+        <w:rFonts w:hint="default" w:ascii="Aptos" w:hAnsi="Aptos"/>
+      </w:rPr>
+    </w:lvl>
+    <w:lvl xmlns:w="http://schemas.openxmlformats.org/wordprocessingml/2006/main" w:ilvl="1">
+      <w:start w:val="1"/>
+      <w:numFmt w:val="bullet"/>
+      <w:lvlText w:val="o"/>
+      <w:lvlJc w:val="left"/>
+      <w:pPr>
+        <w:ind w:left="1440" w:hanging="360"/>
+      </w:pPr>
+      <w:rPr>
+        <w:rFonts w:hint="default" w:ascii="Courier New" w:hAnsi="Courier New"/>
+      </w:rPr>
+    </w:lvl>
+    <w:lvl xmlns:w="http://schemas.openxmlformats.org/wordprocessingml/2006/main" w:ilvl="2">
+      <w:start w:val="1"/>
+      <w:numFmt w:val="bullet"/>
+      <w:lvlText w:val=""/>
+      <w:lvlJc w:val="left"/>
+      <w:pPr>
+        <w:ind w:left="2160" w:hanging="360"/>
+      </w:pPr>
+      <w:rPr>
+        <w:rFonts w:hint="default" w:ascii="Wingdings" w:hAnsi="Wingdings"/>
+      </w:rPr>
+    </w:lvl>
+    <w:lvl xmlns:w="http://schemas.openxmlformats.org/wordprocessingml/2006/main" w:ilvl="3">
+      <w:start w:val="1"/>
+      <w:numFmt w:val="bullet"/>
+      <w:lvlText w:val=""/>
+      <w:lvlJc w:val="left"/>
+      <w:pPr>
+        <w:ind w:left="2880" w:hanging="360"/>
+      </w:pPr>
+      <w:rPr>
+        <w:rFonts w:hint="default" w:ascii="Symbol" w:hAnsi="Symbol"/>
+      </w:rPr>
+    </w:lvl>
+    <w:lvl xmlns:w="http://schemas.openxmlformats.org/wordprocessingml/2006/main" w:ilvl="4">
+      <w:start w:val="1"/>
+      <w:numFmt w:val="bullet"/>
+      <w:lvlText w:val="o"/>
+      <w:lvlJc w:val="left"/>
+      <w:pPr>
+        <w:ind w:left="3600" w:hanging="360"/>
+      </w:pPr>
+      <w:rPr>
+        <w:rFonts w:hint="default" w:ascii="Courier New" w:hAnsi="Courier New"/>
+      </w:rPr>
+    </w:lvl>
+    <w:lvl xmlns:w="http://schemas.openxmlformats.org/wordprocessingml/2006/main" w:ilvl="5">
+      <w:start w:val="1"/>
+      <w:numFmt w:val="bullet"/>
+      <w:lvlText w:val=""/>
+      <w:lvlJc w:val="left"/>
+      <w:pPr>
+        <w:ind w:left="4320" w:hanging="360"/>
+      </w:pPr>
+      <w:rPr>
+        <w:rFonts w:hint="default" w:ascii="Wingdings" w:hAnsi="Wingdings"/>
+      </w:rPr>
+    </w:lvl>
+    <w:lvl xmlns:w="http://schemas.openxmlformats.org/wordprocessingml/2006/main" w:ilvl="6">
+      <w:start w:val="1"/>
+      <w:numFmt w:val="bullet"/>
+      <w:lvlText w:val=""/>
+      <w:lvlJc w:val="left"/>
+      <w:pPr>
+        <w:ind w:left="5040" w:hanging="360"/>
+      </w:pPr>
+      <w:rPr>
+        <w:rFonts w:hint="default" w:ascii="Symbol" w:hAnsi="Symbol"/>
+      </w:rPr>
+    </w:lvl>
+    <w:lvl xmlns:w="http://schemas.openxmlformats.org/wordprocessingml/2006/main" w:ilvl="7">
+      <w:start w:val="1"/>
+      <w:numFmt w:val="bullet"/>
+      <w:lvlText w:val="o"/>
+      <w:lvlJc w:val="left"/>
+      <w:pPr>
+        <w:ind w:left="5760" w:hanging="360"/>
+      </w:pPr>
+      <w:rPr>
+        <w:rFonts w:hint="default" w:ascii="Courier New" w:hAnsi="Courier New"/>
+      </w:rPr>
+    </w:lvl>
+    <w:lvl xmlns:w="http://schemas.openxmlformats.org/wordprocessingml/2006/main" w:ilvl="8">
+      <w:start w:val="1"/>
+      <w:numFmt w:val="bullet"/>
+      <w:lvlText w:val=""/>
+      <w:lvlJc w:val="left"/>
+      <w:pPr>
+        <w:ind w:left="6480" w:hanging="360"/>
+      </w:pPr>
+      <w:rPr>
+        <w:rFonts w:hint="default" w:ascii="Wingdings" w:hAnsi="Wingdings"/>
+      </w:rPr>
+    </w:lvl>
+  </w:abstractNum>
   <w:abstractNum xmlns:w="http://schemas.openxmlformats.org/wordprocessingml/2006/main" w:abstractNumId="1">
     <w:nsid w:val="1cdca2fa"/>
     <w:multiLevelType xmlns:w="http://schemas.openxmlformats.org/wordprocessingml/2006/main" w:val="hybridMultilevel"/>
@@ -246,6 +560,9 @@
       </w:rPr>
     </w:lvl>
   </w:abstractNum>
+  <w:num w:numId="2">
+    <w:abstractNumId w:val="2"/>
+  </w:num>
   <w:num w:numId="1">
     <w:abstractNumId w:val="1"/>
   </w:num>

</xml_diff>